<commit_message>
Rename the three interviewees and widen the participants table
Pseudonyms are now Samiya, Ayna and Reem across the body, transcripts,
participants table and consent forms. The first table column was widened
so the header row no longer wraps.

Co-Authored-By: Claude Opus 5 <noreply@anthropic.com>
Claude-Session: https://claude.ai/code/session_01EG6i6REnRBMzUsj4m2kHAL
</commit_message>
<xml_diff>
--- a/docs/עבודה מסכמת - חווייתן של אימהות ערביות צעירות.docx
+++ b/docs/עבודה מסכמת - חווייתן של אימהות ערביות צעירות.docx
@@ -519,7 +519,7 @@
     <w:tbl>
       <w:tblPr>
         <w:bidiVisual/>
-        <w:tblW w:type="dxa" w:w="9072"/>
+        <w:tblW w:type="dxa" w:w="9022"/>
         <w:tblBorders>
           <w:top w:val="single" w:color="auto" w:sz="4"/>
           <w:left w:val="single" w:color="auto" w:sz="4"/>
@@ -530,11 +530,11 @@
         </w:tblBorders>
       </w:tblPr>
       <w:tblGrid>
-        <w:gridCol w:w="1050"/>
-        <w:gridCol w:w="600"/>
+        <w:gridCol w:w="1300"/>
+        <w:gridCol w:w="550"/>
+        <w:gridCol w:w="1400"/>
         <w:gridCol w:w="1450"/>
-        <w:gridCol w:w="1550"/>
-        <w:gridCol w:w="2150"/>
+        <w:gridCol w:w="2050"/>
         <w:gridCol w:w="2272"/>
       </w:tblGrid>
       <w:tr>
@@ -543,7 +543,7 @@
         </w:trPr>
         <w:tc>
           <w:tcPr>
-            <w:tcW w:type="dxa" w:w="1050"/>
+            <w:tcW w:type="dxa" w:w="1300"/>
             <w:shd w:fill="E8E8E8" w:color="auto" w:val="clear"/>
             <w:tcMar>
               <w:top w:type="dxa" w:w="60"/>
@@ -573,7 +573,7 @@
         </w:tc>
         <w:tc>
           <w:tcPr>
-            <w:tcW w:type="dxa" w:w="600"/>
+            <w:tcW w:type="dxa" w:w="550"/>
             <w:shd w:fill="E8E8E8" w:color="auto" w:val="clear"/>
             <w:tcMar>
               <w:top w:type="dxa" w:w="60"/>
@@ -603,7 +603,7 @@
         </w:tc>
         <w:tc>
           <w:tcPr>
-            <w:tcW w:type="dxa" w:w="1450"/>
+            <w:tcW w:type="dxa" w:w="1400"/>
             <w:shd w:fill="E8E8E8" w:color="auto" w:val="clear"/>
             <w:tcMar>
               <w:top w:type="dxa" w:w="60"/>
@@ -633,7 +633,7 @@
         </w:tc>
         <w:tc>
           <w:tcPr>
-            <w:tcW w:type="dxa" w:w="1550"/>
+            <w:tcW w:type="dxa" w:w="1450"/>
             <w:shd w:fill="E8E8E8" w:color="auto" w:val="clear"/>
             <w:tcMar>
               <w:top w:type="dxa" w:w="60"/>
@@ -663,7 +663,7 @@
         </w:tc>
         <w:tc>
           <w:tcPr>
-            <w:tcW w:type="dxa" w:w="2150"/>
+            <w:tcW w:type="dxa" w:w="2050"/>
             <w:shd w:fill="E8E8E8" w:color="auto" w:val="clear"/>
             <w:tcMar>
               <w:top w:type="dxa" w:w="60"/>
@@ -728,7 +728,7 @@
         </w:trPr>
         <w:tc>
           <w:tcPr>
-            <w:tcW w:type="dxa" w:w="1050"/>
+            <w:tcW w:type="dxa" w:w="1300"/>
             <w:tcMar>
               <w:top w:type="dxa" w:w="60"/>
               <w:left w:type="dxa" w:w="90"/>
@@ -751,13 +751,13 @@
                 <w:szCs w:val="24"/>
                 <w:rtl/>
               </w:rPr>
-              <w:t xml:space="preserve">סמאח</w:t>
+              <w:t xml:space="preserve">סאמייה</w:t>
             </w:r>
           </w:p>
         </w:tc>
         <w:tc>
           <w:tcPr>
-            <w:tcW w:type="dxa" w:w="600"/>
+            <w:tcW w:type="dxa" w:w="550"/>
             <w:tcMar>
               <w:top w:type="dxa" w:w="60"/>
               <w:left w:type="dxa" w:w="90"/>
@@ -786,7 +786,7 @@
         </w:tc>
         <w:tc>
           <w:tcPr>
-            <w:tcW w:type="dxa" w:w="1450"/>
+            <w:tcW w:type="dxa" w:w="1400"/>
             <w:tcMar>
               <w:top w:type="dxa" w:w="60"/>
               <w:left w:type="dxa" w:w="90"/>
@@ -815,7 +815,7 @@
         </w:tc>
         <w:tc>
           <w:tcPr>
-            <w:tcW w:type="dxa" w:w="1550"/>
+            <w:tcW w:type="dxa" w:w="1450"/>
             <w:tcMar>
               <w:top w:type="dxa" w:w="60"/>
               <w:left w:type="dxa" w:w="90"/>
@@ -844,7 +844,7 @@
         </w:tc>
         <w:tc>
           <w:tcPr>
-            <w:tcW w:type="dxa" w:w="2150"/>
+            <w:tcW w:type="dxa" w:w="2050"/>
             <w:tcMar>
               <w:top w:type="dxa" w:w="60"/>
               <w:left w:type="dxa" w:w="90"/>
@@ -907,7 +907,7 @@
         </w:trPr>
         <w:tc>
           <w:tcPr>
-            <w:tcW w:type="dxa" w:w="1050"/>
+            <w:tcW w:type="dxa" w:w="1300"/>
             <w:tcMar>
               <w:top w:type="dxa" w:w="60"/>
               <w:left w:type="dxa" w:w="90"/>
@@ -930,13 +930,13 @@
                 <w:szCs w:val="24"/>
                 <w:rtl/>
               </w:rPr>
-              <w:t xml:space="preserve">ראניה</w:t>
+              <w:t xml:space="preserve">עיינא</w:t>
             </w:r>
           </w:p>
         </w:tc>
         <w:tc>
           <w:tcPr>
-            <w:tcW w:type="dxa" w:w="600"/>
+            <w:tcW w:type="dxa" w:w="550"/>
             <w:tcMar>
               <w:top w:type="dxa" w:w="60"/>
               <w:left w:type="dxa" w:w="90"/>
@@ -965,7 +965,7 @@
         </w:tc>
         <w:tc>
           <w:tcPr>
-            <w:tcW w:type="dxa" w:w="1450"/>
+            <w:tcW w:type="dxa" w:w="1400"/>
             <w:tcMar>
               <w:top w:type="dxa" w:w="60"/>
               <w:left w:type="dxa" w:w="90"/>
@@ -994,7 +994,7 @@
         </w:tc>
         <w:tc>
           <w:tcPr>
-            <w:tcW w:type="dxa" w:w="1550"/>
+            <w:tcW w:type="dxa" w:w="1450"/>
             <w:tcMar>
               <w:top w:type="dxa" w:w="60"/>
               <w:left w:type="dxa" w:w="90"/>
@@ -1023,7 +1023,7 @@
         </w:tc>
         <w:tc>
           <w:tcPr>
-            <w:tcW w:type="dxa" w:w="2150"/>
+            <w:tcW w:type="dxa" w:w="2050"/>
             <w:tcMar>
               <w:top w:type="dxa" w:w="60"/>
               <w:left w:type="dxa" w:w="90"/>
@@ -1086,7 +1086,7 @@
         </w:trPr>
         <w:tc>
           <w:tcPr>
-            <w:tcW w:type="dxa" w:w="1050"/>
+            <w:tcW w:type="dxa" w:w="1300"/>
             <w:tcMar>
               <w:top w:type="dxa" w:w="60"/>
               <w:left w:type="dxa" w:w="90"/>
@@ -1109,13 +1109,13 @@
                 <w:szCs w:val="24"/>
                 <w:rtl/>
               </w:rPr>
-              <w:t xml:space="preserve">הודא</w:t>
+              <w:t xml:space="preserve">רים</w:t>
             </w:r>
           </w:p>
         </w:tc>
         <w:tc>
           <w:tcPr>
-            <w:tcW w:type="dxa" w:w="600"/>
+            <w:tcW w:type="dxa" w:w="550"/>
             <w:tcMar>
               <w:top w:type="dxa" w:w="60"/>
               <w:left w:type="dxa" w:w="90"/>
@@ -1144,7 +1144,7 @@
         </w:tc>
         <w:tc>
           <w:tcPr>
-            <w:tcW w:type="dxa" w:w="1450"/>
+            <w:tcW w:type="dxa" w:w="1400"/>
             <w:tcMar>
               <w:top w:type="dxa" w:w="60"/>
               <w:left w:type="dxa" w:w="90"/>
@@ -1173,7 +1173,7 @@
         </w:tc>
         <w:tc>
           <w:tcPr>
-            <w:tcW w:type="dxa" w:w="1550"/>
+            <w:tcW w:type="dxa" w:w="1450"/>
             <w:tcMar>
               <w:top w:type="dxa" w:w="60"/>
               <w:left w:type="dxa" w:w="90"/>
@@ -1202,7 +1202,7 @@
         </w:tc>
         <w:tc>
           <w:tcPr>
-            <w:tcW w:type="dxa" w:w="2150"/>
+            <w:tcW w:type="dxa" w:w="2050"/>
             <w:tcMar>
               <w:top w:type="dxa" w:w="60"/>
               <w:left w:type="dxa" w:w="90"/>
@@ -1588,7 +1588,7 @@
           <w:szCs w:val="24"/>
           <w:rtl/>
         </w:rPr>
-        <w:t xml:space="preserve">סמאח פתחה כך: "היום מתחיל בחמש, לפני שהם קמים, כי זה הזמן היחיד שהבית שקט. אני עושה שעה, ואז בשש הקטנה מתעוררת וזהו, נגמר."</w:t>
+        <w:t xml:space="preserve">סאמייה פתחה כך: "היום מתחיל בחמש, לפני שהם קמים, כי זה הזמן היחיד שהבית שקט. אני עושה שעה, ואז בשש הקטנה מתעוררת וזהו, נגמר."</w:t>
       </w:r>
     </w:p>
     <w:p>
@@ -1605,23 +1605,23 @@
           <w:szCs w:val="24"/>
           <w:rtl/>
         </w:rPr>
-        <w:t xml:space="preserve">מהיישוב עד המכללה זה שעה וחצי בבוקר, אם אין פקק. אני יוצאת בשש וחצי ומגיעה לשיעור של שמונה. אחרי השיעור האחרון אני רצה לאוטו כדי להספיק לאסוף את הקטן, ובדרך חזרה זה שוב שעה וחצי. יש לי שלוש שעות ביום שאני יושבת באוטו. אנשים אומרים לי תלמדי בנסיעה, אני נוהגת. (הודא)</w:t>
-      </w:r>
-    </w:p>
-    <w:p>
-      <w:pPr>
-        <w:bidi/>
-        <w:spacing w:after="0" w:line="480" w:lineRule="auto"/>
-        <w:jc w:val="both"/>
-      </w:pPr>
-      <w:r>
-        <w:rPr>
-          <w:rFonts w:ascii="David" w:cs="David" w:eastAsia="David" w:hAnsi="David"/>
-          <w:sz w:val="24"/>
-          <w:szCs w:val="24"/>
-          <w:rtl/>
-        </w:rPr>
-        <w:t xml:space="preserve">הנסיעה אינה זמן פנוי ואינה זמן עבודה. היא נגרעת מן היום בלי להיחשב לאיש, ובשלושת הראיונות לא הוזכרה כשנשאלו על עומס אלא רק כשהתבקשו לתאר שעה אחר שעה. ראניה ניסחה את המסקנה: "השינה היא הדבר היחיד שאפשר לקצץ בו." כשהזמן מחולק כך, אף נוכחות אינה שלמה, וזו התימה הבאה.</w:t>
+        <w:t xml:space="preserve">מהיישוב עד המכללה זה שעה וחצי בבוקר, אם אין פקק. אני יוצאת בשש וחצי ומגיעה לשיעור של שמונה. אחרי השיעור האחרון אני רצה לאוטו כדי להספיק לאסוף את הקטן, ובדרך חזרה זה שוב שעה וחצי. יש לי שלוש שעות ביום שאני יושבת באוטו. אנשים אומרים לי תלמדי בנסיעה, אני נוהגת. (רים)</w:t>
+      </w:r>
+    </w:p>
+    <w:p>
+      <w:pPr>
+        <w:bidi/>
+        <w:spacing w:after="0" w:line="480" w:lineRule="auto"/>
+        <w:jc w:val="both"/>
+      </w:pPr>
+      <w:r>
+        <w:rPr>
+          <w:rFonts w:ascii="David" w:cs="David" w:eastAsia="David" w:hAnsi="David"/>
+          <w:sz w:val="24"/>
+          <w:szCs w:val="24"/>
+          <w:rtl/>
+        </w:rPr>
+        <w:t xml:space="preserve">הנסיעה אינה זמן פנוי ואינה זמן עבודה. היא נגרעת מן היום בלי להיחשב לאיש, ובשלושת הראיונות לא הוזכרה כשנשאלו על עומס אלא רק כשהתבקשו לתאר שעה אחר שעה. עיינא ניסחה את המסקנה: "השינה היא הדבר היחיד שאפשר לקצץ בו." כשהזמן מחולק כך, אף נוכחות אינה שלמה, וזו התימה הבאה.</w:t>
       </w:r>
     </w:p>
     <w:p>
@@ -1671,23 +1671,23 @@
           <w:szCs w:val="24"/>
           <w:rtl/>
         </w:rPr>
-        <w:t xml:space="preserve">ראניה תיארה את הפיצול בקצרה: "אני יושבת בהרצאה וחושבת על הגן. אני בגן וחושבת על המבחן. אין רגע אחד שאני נמצאת רק במקום אחד." הודא דחתה את המסגור הרגשי שהוצע לה: "לא אשמה. אחריות. אני אחראית, וזה לא אותו דבר."</w:t>
-      </w:r>
-    </w:p>
-    <w:p>
-      <w:pPr>
-        <w:bidi/>
-        <w:spacing w:after="0" w:line="480" w:lineRule="auto"/>
-        <w:jc w:val="both"/>
-      </w:pPr>
-      <w:r>
-        <w:rPr>
-          <w:rFonts w:ascii="David" w:cs="David" w:eastAsia="David" w:hAnsi="David"/>
-          <w:sz w:val="24"/>
-          <w:szCs w:val="24"/>
-          <w:rtl/>
-        </w:rPr>
-        <w:t xml:space="preserve">ההבחנה אינה משחק מילים. סמאח הסבירה אותה במונחים חברתיים: "אם משהו קורה לילד, אף אחד לא ישאל איפה היה אבא. ישאלו איפה הייתה האמא." מדובר פחות ברגש פרטי ויותר בעמדה שהחברה מקצה. עתאמנה מצאה בקרב אימהות פלסטיניות בישראל שהאחריות האימהית מובנית כמטלה מוסרית רחבה, המשתרעת גם על הישגי הילדים ועל שלומם הרגשי, ושהאימהות פועלות בתוכה כסוכנות ולא רק כקורבנות (Athamneh, 2024). המרואיינות כאן אינן מתארות את עצמן כנשברות תחת האחריות אלא כמנהלות אותה, ומכאן השאלה מי מסייע להן בפועל.</w:t>
+        <w:t xml:space="preserve">עיינא תיארה את הפיצול בקצרה: "אני יושבת בהרצאה וחושבת על הגן. אני בגן וחושבת על המבחן. אין רגע אחד שאני נמצאת רק במקום אחד." רים דחתה את המסגור הרגשי שהוצע לה: "לא אשמה. אחריות. אני אחראית, וזה לא אותו דבר."</w:t>
+      </w:r>
+    </w:p>
+    <w:p>
+      <w:pPr>
+        <w:bidi/>
+        <w:spacing w:after="0" w:line="480" w:lineRule="auto"/>
+        <w:jc w:val="both"/>
+      </w:pPr>
+      <w:r>
+        <w:rPr>
+          <w:rFonts w:ascii="David" w:cs="David" w:eastAsia="David" w:hAnsi="David"/>
+          <w:sz w:val="24"/>
+          <w:szCs w:val="24"/>
+          <w:rtl/>
+        </w:rPr>
+        <w:t xml:space="preserve">ההבחנה אינה משחק מילים. סאמייה הסבירה אותה במונחים חברתיים: "אם משהו קורה לילד, אף אחד לא ישאל איפה היה אבא. ישאלו איפה הייתה האמא." מדובר פחות ברגש פרטי ויותר בעמדה שהחברה מקצה. עתאמנה מצאה בקרב אימהות פלסטיניות בישראל שהאחריות האימהית מובנית כמטלה מוסרית רחבה, המשתרעת גם על הישגי הילדים ועל שלומם הרגשי, ושהאימהות פועלות בתוכה כסוכנות ולא רק כקורבנות (Athamneh, 2024). המרואיינות כאן אינן מתארות את עצמן כנשברות תחת האחריות אלא כמנהלות אותה, ומכאן השאלה מי מסייע להן בפועל.</w:t>
       </w:r>
     </w:p>
     <w:p>
@@ -1737,39 +1737,39 @@
           <w:szCs w:val="24"/>
           <w:rtl/>
         </w:rPr>
-        <w:t xml:space="preserve">סמאח אמרה: "חמאתי (حماتي, חמותי) לוקחת אותם ארבעה ימים בשבוע. בלעדיה אין תואר, פשוט אין", ומיד הוסיפה: "אני מרגישה שאני חייבת לה. היא אף פעם לא אמרה מילה, זה אני." התמיכה מתוארת כהלוואה. היא מאפשרת את הלימודים ובו בזמן פותחת חשבון שאינו נסגר. הודא, שאין לה סידור קבוע, תיארה את הצד השני: "אין מעון לגיל שנה ביישוב שלי. אין. אז זה חמאתי או כלום."</w:t>
-      </w:r>
-    </w:p>
-    <w:p>
-      <w:pPr>
-        <w:bidi/>
-        <w:spacing w:after="0" w:line="480" w:lineRule="auto"/>
-        <w:jc w:val="both"/>
-      </w:pPr>
-      <w:r>
-        <w:rPr>
-          <w:rFonts w:ascii="David" w:cs="David" w:eastAsia="David" w:hAnsi="David"/>
-          <w:sz w:val="24"/>
-          <w:szCs w:val="24"/>
-          <w:rtl/>
-        </w:rPr>
-        <w:t xml:space="preserve">נקודה שנייה עלתה בדבריה של ראניה: "בעלי עוזר המון, באמת." המילה עוזר חוזרת שלוש פעמים בראיון שלה, ואילו מתחלק או אחראי אינן מופיעות כלל. הפועל משמר את הנחת היסוד שהאחריות שייכת לאישה ושהגבר תורם לה, וזהו הפער שתיארה הוקשילד בין הצהרה על שוויון לבין חלוקת העבודה בפועל (Hochschild, 1989). צבאח-כרכבי מראה שבמשפחות ערביות-פלסטיניות בישראל החלוקה נותרת ממוגדרת אך אינה אחידה, ומשתנה לפי משאבי המשפחה ומיקומה החברתי (Sabbah-Karkabi, 2024). השונות בין שלוש המרואיינות ממחישה זאת.</w:t>
-      </w:r>
-    </w:p>
-    <w:p>
-      <w:pPr>
-        <w:bidi/>
-        <w:spacing w:after="0" w:line="480" w:lineRule="auto"/>
-        <w:jc w:val="both"/>
-      </w:pPr>
-      <w:r>
-        <w:rPr>
-          <w:rFonts w:ascii="David" w:cs="David" w:eastAsia="David" w:hAnsi="David"/>
-          <w:sz w:val="24"/>
-          <w:szCs w:val="24"/>
-          <w:rtl/>
-        </w:rPr>
-        <w:t xml:space="preserve">נקודה שלישית נוגעת לכך שאותה משפחה שמחזיקה גם מתבוננת. הודא ניסחה זאת כך: "שו ביחכו א-נאס (شو بيحكوا الناس, מה יגידו האנשים). זה לא משפט שמישהו אומר לך. זה כמו מזג אוויר, זה פשוט שם." התמיכה והפיקוח מגיעים מאותו מקור, ולכן אי אפשר לקבל את הראשונה ולהתנער מן השני. כשהמעגל המשפחתי אינו מספיק, נותר לפנות אל המוסדות.</w:t>
+        <w:t xml:space="preserve">סאמייה אמרה: "חמאתי (حماتي, חמותי) לוקחת אותם ארבעה ימים בשבוע. בלעדיה אין תואר, פשוט אין", ומיד הוסיפה: "אני מרגישה שאני חייבת לה. היא אף פעם לא אמרה מילה, זה אני." התמיכה מתוארת כהלוואה. היא מאפשרת את הלימודים ובו בזמן פותחת חשבון שאינו נסגר. רים, שאין לה סידור קבוע, תיארה את הצד השני: "אין מעון לגיל שנה ביישוב שלי. אין. אז זה חמאתי או כלום."</w:t>
+      </w:r>
+    </w:p>
+    <w:p>
+      <w:pPr>
+        <w:bidi/>
+        <w:spacing w:after="0" w:line="480" w:lineRule="auto"/>
+        <w:jc w:val="both"/>
+      </w:pPr>
+      <w:r>
+        <w:rPr>
+          <w:rFonts w:ascii="David" w:cs="David" w:eastAsia="David" w:hAnsi="David"/>
+          <w:sz w:val="24"/>
+          <w:szCs w:val="24"/>
+          <w:rtl/>
+        </w:rPr>
+        <w:t xml:space="preserve">נקודה שנייה עלתה בדבריה של עיינא: "בעלי עוזר המון, באמת." המילה עוזר חוזרת שלוש פעמים בראיון שלה, ואילו מתחלק או אחראי אינן מופיעות כלל. הפועל משמר את הנחת היסוד שהאחריות שייכת לאישה ושהגבר תורם לה, וזהו הפער שתיארה הוקשילד בין הצהרה על שוויון לבין חלוקת העבודה בפועל (Hochschild, 1989). צבאח-כרכבי מראה שבמשפחות ערביות-פלסטיניות בישראל החלוקה נותרת ממוגדרת אך אינה אחידה, ומשתנה לפי משאבי המשפחה ומיקומה החברתי (Sabbah-Karkabi, 2024). השונות בין שלוש המרואיינות ממחישה זאת.</w:t>
+      </w:r>
+    </w:p>
+    <w:p>
+      <w:pPr>
+        <w:bidi/>
+        <w:spacing w:after="0" w:line="480" w:lineRule="auto"/>
+        <w:jc w:val="both"/>
+      </w:pPr>
+      <w:r>
+        <w:rPr>
+          <w:rFonts w:ascii="David" w:cs="David" w:eastAsia="David" w:hAnsi="David"/>
+          <w:sz w:val="24"/>
+          <w:szCs w:val="24"/>
+          <w:rtl/>
+        </w:rPr>
+        <w:t xml:space="preserve">נקודה שלישית נוגעת לכך שאותה משפחה שמחזיקה גם מתבוננת. רים ניסחה זאת כך: "שו ביחכו א-נאס (شو بيحكوا الناس, מה יגידו האנשים). זה לא משפט שמישהו אומר לך. זה כמו מזג אוויר, זה פשוט שם." התמיכה והפיקוח מגיעים מאותו מקור, ולכן אי אפשר לקבל את הראשונה ולהתנער מן השני. כשהמעגל המשפחתי אינו מספיק, נותר לפנות אל המוסדות.</w:t>
       </w:r>
     </w:p>
     <w:p>
@@ -1820,39 +1820,39 @@
           <w:szCs w:val="24"/>
           <w:rtl/>
         </w:rPr>
-        <w:t xml:space="preserve">המבחן נקבע לשמונה בבוקר ביום שאין גן. שאלתי אם אפשר מועד אחר, אמרו לי שיש מועד ב'. מועד ב' זה לא פתרון, זה עונש, כי אז אני לומדת את זה פעמיים ומאבדת עוד שבוע. אף אחד לא חשב שיש כאלה שהבוקר שלהן לא פנוי. (הודא)</w:t>
-      </w:r>
-    </w:p>
-    <w:p>
-      <w:pPr>
-        <w:bidi/>
-        <w:spacing w:after="0" w:line="480" w:lineRule="auto"/>
-        <w:jc w:val="both"/>
-      </w:pPr>
-      <w:r>
-        <w:rPr>
-          <w:rFonts w:ascii="David" w:cs="David" w:eastAsia="David" w:hAnsi="David"/>
-          <w:sz w:val="24"/>
-          <w:szCs w:val="24"/>
-          <w:rtl/>
-        </w:rPr>
-        <w:t xml:space="preserve">לצד מועדי הבחינות עלה חסם שאינו מופיע בשום נוהל. ראניה תיארה אותו כך: "אני חושבת בערבית וכותבת בעברית. זה לוקח לי פי שניים זמן, וזה לא בגלל שאני לא מבינה את החומר." זהו החסם שתיארו אראר וחאג' יחיא, שהצביעו על השפה ועל המרחק כמכשולים מבניים בדרכם של סטודנטים ערבים (Arar &amp; Haj-Yehia, 2016). כשחסם השפה נפגש עם שלוש שעות נסיעה ועם היעדר מעון ביישוב, הזמן שנותר ללימודים מצטמצם פעמיים.</w:t>
-      </w:r>
-    </w:p>
-    <w:p>
-      <w:pPr>
-        <w:bidi/>
-        <w:spacing w:after="0" w:line="480" w:lineRule="auto"/>
-        <w:jc w:val="both"/>
-      </w:pPr>
-      <w:r>
-        <w:rPr>
-          <w:rFonts w:ascii="David" w:cs="David" w:eastAsia="David" w:hAnsi="David"/>
-          <w:sz w:val="24"/>
-          <w:szCs w:val="24"/>
-          <w:rtl/>
-        </w:rPr>
-        <w:t xml:space="preserve">סמאח תיארה שני קצוות באותו סמסטר: "יש מרצה שאמרה לי תביאי אותה, שתשב מאחורה עם טאבלט. ויש מרצה שאמר לי שזה לא מעון." ההבדל אינו נעוץ במדיניות אלא באדם. ההתאמות קיימות, אך הן ניתנות כטובה אישית ולא כזכות, ולכן אינן ניתנות לתכנון ולא לתביעה. הממצא תואם את מסקנתם של סאלי ואחרים, שלפיה הצלחתן של אימהות סטודנטיות נשענת על גורם מוסדי בודד שנקרה בדרכן ולא על מדיניות סדורה, ולכן היא מקרית מטבעה (Sallee et al., 2025). מכאן מתחדדת השאלה מדוע בכל זאת ממשיכות המרואיינות ללמוד.</w:t>
+        <w:t xml:space="preserve">המבחן נקבע לשמונה בבוקר ביום שאין גן. שאלתי אם אפשר מועד אחר, אמרו לי שיש מועד ב'. מועד ב' זה לא פתרון, זה עונש, כי אז אני לומדת את זה פעמיים ומאבדת עוד שבוע. אף אחד לא חשב שיש כאלה שהבוקר שלהן לא פנוי. (רים)</w:t>
+      </w:r>
+    </w:p>
+    <w:p>
+      <w:pPr>
+        <w:bidi/>
+        <w:spacing w:after="0" w:line="480" w:lineRule="auto"/>
+        <w:jc w:val="both"/>
+      </w:pPr>
+      <w:r>
+        <w:rPr>
+          <w:rFonts w:ascii="David" w:cs="David" w:eastAsia="David" w:hAnsi="David"/>
+          <w:sz w:val="24"/>
+          <w:szCs w:val="24"/>
+          <w:rtl/>
+        </w:rPr>
+        <w:t xml:space="preserve">לצד מועדי הבחינות עלה חסם שאינו מופיע בשום נוהל. עיינא תיארה אותו כך: "אני חושבת בערבית וכותבת בעברית. זה לוקח לי פי שניים זמן, וזה לא בגלל שאני לא מבינה את החומר." זהו החסם שתיארו אראר וחאג' יחיא, שהצביעו על השפה ועל המרחק כמכשולים מבניים בדרכם של סטודנטים ערבים (Arar &amp; Haj-Yehia, 2016). כשחסם השפה נפגש עם שלוש שעות נסיעה ועם היעדר מעון ביישוב, הזמן שנותר ללימודים מצטמצם פעמיים.</w:t>
+      </w:r>
+    </w:p>
+    <w:p>
+      <w:pPr>
+        <w:bidi/>
+        <w:spacing w:after="0" w:line="480" w:lineRule="auto"/>
+        <w:jc w:val="both"/>
+      </w:pPr>
+      <w:r>
+        <w:rPr>
+          <w:rFonts w:ascii="David" w:cs="David" w:eastAsia="David" w:hAnsi="David"/>
+          <w:sz w:val="24"/>
+          <w:szCs w:val="24"/>
+          <w:rtl/>
+        </w:rPr>
+        <w:t xml:space="preserve">סאמייה תיארה שני קצוות באותו סמסטר: "יש מרצה שאמרה לי תביאי אותה, שתשב מאחורה עם טאבלט. ויש מרצה שאמר לי שזה לא מעון." ההבדל אינו נעוץ במדיניות אלא באדם. ההתאמות קיימות, אך הן ניתנות כטובה אישית ולא כזכות, ולכן אינן ניתנות לתכנון ולא לתביעה. הממצא תואם את מסקנתם של סאלי ואחרים, שלפיה הצלחתן של אימהות סטודנטיות נשענת על גורם מוסדי בודד שנקרה בדרכן ולא על מדיניות סדורה, ולכן היא מקרית מטבעה (Sallee et al., 2025). מכאן מתחדדת השאלה מדוע בכל זאת ממשיכות המרואיינות ללמוד.</w:t>
       </w:r>
     </w:p>
     <w:p>
@@ -1902,7 +1902,7 @@
           <w:szCs w:val="24"/>
           <w:rtl/>
         </w:rPr>
-        <w:t xml:space="preserve">ראניה אמרה: "בדי אכון אישי (بدي أكون إشي, אני רוצה להיות משהו). לא במקום אמא. ביחד עם." הודא הוסיפה נימוק אחר לגמרי: "אם מחר אני לבד, אני צריכה לדעת שאני יכולה להחזיק את הילדים. תעודה זה ביטחון." סמאח קשרה את הלימודים לדמות שהיא מציגה בפני ילדיה: "אני רוצה שהבת שלי תראה אותי לומדת."</w:t>
+        <w:t xml:space="preserve">עיינא אמרה: "בדי אכון אישי (بدي أكون إشي, אני רוצה להיות משהו). לא במקום אמא. ביחד עם." רים הוסיפה נימוק אחר לגמרי: "אם מחר אני לבד, אני צריכה לדעת שאני יכולה להחזיק את הילדים. תעודה זה ביטחון." סאמייה קשרה את הלימודים לדמות שהיא מציגה בפני ילדיה: "אני רוצה שהבת שלי תראה אותי לומדת."</w:t>
       </w:r>
     </w:p>
     <w:p>
@@ -1919,7 +1919,7 @@
           <w:szCs w:val="24"/>
           <w:rtl/>
         </w:rPr>
-        <w:t xml:space="preserve">בהתחלה נרשמתי בשביל משכורת יותר טובה, בלי רומנטיקה. אבל אני יושבת בשיעור, פתאום מדברים על משהו ואני חושבת על זה שעתיים אחר כך, וזה החלק היחיד ביום שאני חושבת בו על משהו שהוא לא לוגיסטיקה. אז זה כבר לא רק הכסף. (סמאח)</w:t>
+        <w:t xml:space="preserve">בהתחלה נרשמתי בשביל משכורת יותר טובה, בלי רומנטיקה. אבל אני יושבת בשיעור, פתאום מדברים על משהו ואני חושבת על זה שעתיים אחר כך, וזה החלק היחיד ביום שאני חושבת בו על משהו שהוא לא לוגיסטיקה. אז זה כבר לא רק הכסף. (סאמייה)</w:t>
       </w:r>
     </w:p>
     <w:p>
@@ -2033,7 +2033,7 @@
           <w:szCs w:val="24"/>
           <w:rtl/>
         </w:rPr>
-        <w:t xml:space="preserve">התימה החמישית מסייגת את התמונה. מלר ומרנין-דיסטלפלד מצאו שסטודנטיות ערביות-פלסטיניות אינן מציגות את ההשכלה כתחליף לנישואים ולאימהות אלא כרכיב נוסף בזהותן (Meler &amp; Marnin-Distelfeld, 2024), וזה בדיוק ניסוחה של ראניה, "לא במקום אמא, ביחד עם". קוליק בחנה לצד הקונפליקט גם העשרת תפקידים והראתה ששני התהליכים מתקיימים בו זמנית (Kulik, 2025). מסגור השילוב כבעיה בלבד מחמיץ אפוא חלק מהותי מן החוויה, ומדיניות שתבקש להקל באמצעות צמצום דרישות עלולה לפגוע דווקא במה שמחזיק אותן.</w:t>
+        <w:t xml:space="preserve">התימה החמישית מסייגת את התמונה. מלר ומרנין-דיסטלפלד מצאו שסטודנטיות ערביות-פלסטיניות אינן מציגות את ההשכלה כתחליף לנישואים ולאימהות אלא כרכיב נוסף בזהותן (Meler &amp; Marnin-Distelfeld, 2024), וזה בדיוק ניסוחה של עיינא, "לא במקום אמא, ביחד עם". קוליק בחנה לצד הקונפליקט גם העשרת תפקידים והראתה ששני התהליכים מתקיימים בו זמנית (Kulik, 2025). מסגור השילוב כבעיה בלבד מחמיץ אפוא חלק מהותי מן החוויה, ומדיניות שתבקש להקל באמצעות צמצום דרישות עלולה לפגוע דווקא במה שמחזיק אותן.</w:t>
       </w:r>
     </w:p>
     <w:p>
@@ -2131,7 +2131,7 @@
           <w:szCs w:val="24"/>
           <w:rtl/>
         </w:rPr>
-        <w:t xml:space="preserve">בשלב הקידוד עלתה התלבטות ממשית. האמירה של סמאח, "אני מרגישה שאני חייבת לה, היא אף פעם לא אמרה מילה, זה אני", התאימה לשתי קטגוריות: רשת תמיכה ואחריות פנימית. השיוך לתימת המשפחה נבחר משום שההקשר היה תיאור של סידור הילדים, ומשום שהחוב מתקיים כלפי אדם מסוים ולא כלפי אידיאל מופשט. התלבטות דומה נגעה לשאלה אם הנסיעות הן תימה בפני עצמה, והן שולבו בתימת הזמן משום ששלוש המרואיינות דיברו עליהן בתוך תיאור היום. שתי ההחלטות והנימוקים תועדו בשביל הביקורת.</w:t>
+        <w:t xml:space="preserve">בשלב הקידוד עלתה התלבטות ממשית. האמירה של סאמייה, "אני מרגישה שאני חייבת לה, היא אף פעם לא אמרה מילה, זה אני", התאימה לשתי קטגוריות: רשת תמיכה ואחריות פנימית. השיוך לתימת המשפחה נבחר משום שההקשר היה תיאור של סידור הילדים, ומשום שהחוב מתקיים כלפי אדם מסוים ולא כלפי אידיאל מופשט. התלבטות דומה נגעה לשאלה אם הנסיעות הן תימה בפני עצמה, והן שולבו בתימת הזמן משום ששלוש המרואיינות דיברו עליהן בתוך תיאור היום. שתי ההחלטות והנימוקים תועדו בשביל הביקורת.</w:t>
       </w:r>
     </w:p>
     <w:p>
@@ -2197,23 +2197,23 @@
           <w:szCs w:val="24"/>
           <w:rtl/>
         </w:rPr>
-        <w:t xml:space="preserve">זה לא מה שקרה. בראיון עם הודא, כשסיפרה על שלוש שעות ביום באוטו, תפסתי את עצמי חושבת שהמצב שלי קל בהרבה, ומיד אחר כך מתביישת בכך שהשוויתי. השוואה כזאת הופכת את מי שיושבת מולי לרקע לסיפור שלי.</w:t>
-      </w:r>
-    </w:p>
-    <w:p>
-      <w:pPr>
-        <w:bidi/>
-        <w:spacing w:after="0" w:line="480" w:lineRule="auto"/>
-        <w:jc w:val="both"/>
-      </w:pPr>
-      <w:r>
-        <w:rPr>
-          <w:rFonts w:ascii="David" w:cs="David" w:eastAsia="David" w:hAnsi="David"/>
-          <w:sz w:val="24"/>
-          <w:szCs w:val="24"/>
-          <w:rtl/>
-        </w:rPr>
-        <w:t xml:space="preserve">הדבר הפחות מחמיא שלמדתי על עצמי נוגע לרגע שבו ראניה בכתה. הרצון הראשון שלי לא היה לתמוך בה, הוא היה שהיא תפסיק, כי לא ידעתי מה לעשות ופחדתי שהראיון יתקלקל. עצרתי את ההקלטה ושאלתי אם היא רוצה להפסיק, וזה היה הדבר הנכון, אבל המניע שלי באותו רגע היה מעורב הרבה יותר ממה שנעים לכתוב.</w:t>
+        <w:t xml:space="preserve">זה לא מה שקרה. בראיון עם רים, כשסיפרה על שלוש שעות ביום באוטו, תפסתי את עצמי חושבת שהמצב שלי קל בהרבה, ומיד אחר כך מתביישת בכך שהשוויתי. השוואה כזאת הופכת את מי שיושבת מולי לרקע לסיפור שלי.</w:t>
+      </w:r>
+    </w:p>
+    <w:p>
+      <w:pPr>
+        <w:bidi/>
+        <w:spacing w:after="0" w:line="480" w:lineRule="auto"/>
+        <w:jc w:val="both"/>
+      </w:pPr>
+      <w:r>
+        <w:rPr>
+          <w:rFonts w:ascii="David" w:cs="David" w:eastAsia="David" w:hAnsi="David"/>
+          <w:sz w:val="24"/>
+          <w:szCs w:val="24"/>
+          <w:rtl/>
+        </w:rPr>
+        <w:t xml:space="preserve">הדבר הפחות מחמיא שלמדתי על עצמי נוגע לרגע שבו עיינא בכתה. הרצון הראשון שלי לא היה לתמוך בה, הוא היה שהיא תפסיק, כי לא ידעתי מה לעשות ופחדתי שהראיון יתקלקל. עצרתי את ההקלטה ושאלתי אם היא רוצה להפסיק, וזה היה הדבר הנכון, אבל המניע שלי באותו רגע היה מעורב הרבה יותר ממה שנעים לכתוב.</w:t>
       </w:r>
     </w:p>
     <w:p>
@@ -2245,7 +2245,7 @@
           <w:szCs w:val="24"/>
           <w:rtl/>
         </w:rPr>
-        <w:t xml:space="preserve">מה שנשאר איתי הוא המילים של ראניה, בדי אכון אישי. לפני העבודה הזאת הייתי מתארת לימודים בזמן אימהות כוויתור שאני עושה על משהו אחר. אחרי שלושת הראיונות אני חושבת על זה אחרת. השילוב הוא לא רק מה שנלקח, הוא גם המקום היחיד שבו כמה מהנשים האלה מדברות על עצמן בלשון עתיד. זו לא מסקנה מחקרית, זו מסקנה שלי.</w:t>
+        <w:t xml:space="preserve">מה שנשאר איתי הוא המילים של עיינא, בדי אכון אישי. לפני העבודה הזאת הייתי מתארת לימודים בזמן אימהות כוויתור שאני עושה על משהו אחר. אחרי שלושת הראיונות אני חושבת על זה אחרת. השילוב הוא לא רק מה שנלקח, הוא גם המקום היחיד שבו כמה מהנשים האלה מדברות על עצמן בלשון עתיד. זו לא מסקנה מחקרית, זו מסקנה שלי.</w:t>
       </w:r>
     </w:p>
     <w:p>
@@ -3008,7 +3008,7 @@
           <w:szCs w:val="24"/>
           <w:rtl/>
         </w:rPr>
-        <w:t xml:space="preserve">ראיון 1: סמאח, בת 27, שנה ב' לעבודה סוציאלית. נערך בביתה, 19 במאי 2026, 72 דקות.</w:t>
+        <w:t xml:space="preserve">ראיון 1: סאמייה, בת 27, שנה ב' לעבודה סוציאלית. נערך בביתה, 19 במאי 2026, 72 דקות.</w:t>
       </w:r>
     </w:p>
     <w:p>
@@ -3053,7 +3053,7 @@
           <w:szCs w:val="24"/>
           <w:rtl/>
         </w:rPr>
-        <w:t xml:space="preserve">סמאח: </w:t>
+        <w:t xml:space="preserve">סאמייה: </w:t>
       </w:r>
       <w:r>
         <w:rPr>
@@ -3107,7 +3107,7 @@
           <w:szCs w:val="24"/>
           <w:rtl/>
         </w:rPr>
-        <w:t xml:space="preserve">סמאח: </w:t>
+        <w:t xml:space="preserve">סאמייה: </w:t>
       </w:r>
       <w:r>
         <w:rPr>
@@ -3161,7 +3161,7 @@
           <w:szCs w:val="24"/>
           <w:rtl/>
         </w:rPr>
-        <w:t xml:space="preserve">סמאח: </w:t>
+        <w:t xml:space="preserve">סאמייה: </w:t>
       </w:r>
       <w:r>
         <w:rPr>
@@ -3215,7 +3215,7 @@
           <w:szCs w:val="24"/>
           <w:rtl/>
         </w:rPr>
-        <w:t xml:space="preserve">סמאח: </w:t>
+        <w:t xml:space="preserve">סאמייה: </w:t>
       </w:r>
       <w:r>
         <w:rPr>
@@ -3269,7 +3269,7 @@
           <w:szCs w:val="24"/>
           <w:rtl/>
         </w:rPr>
-        <w:t xml:space="preserve">סמאח: </w:t>
+        <w:t xml:space="preserve">סאמייה: </w:t>
       </w:r>
       <w:r>
         <w:rPr>
@@ -3323,7 +3323,7 @@
           <w:szCs w:val="24"/>
           <w:rtl/>
         </w:rPr>
-        <w:t xml:space="preserve">סמאח: </w:t>
+        <w:t xml:space="preserve">סאמייה: </w:t>
       </w:r>
       <w:r>
         <w:rPr>
@@ -3377,7 +3377,7 @@
           <w:szCs w:val="24"/>
           <w:rtl/>
         </w:rPr>
-        <w:t xml:space="preserve">סמאח: </w:t>
+        <w:t xml:space="preserve">סאמייה: </w:t>
       </w:r>
       <w:r>
         <w:rPr>
@@ -3431,7 +3431,7 @@
           <w:szCs w:val="24"/>
           <w:rtl/>
         </w:rPr>
-        <w:t xml:space="preserve">סמאח: </w:t>
+        <w:t xml:space="preserve">סאמייה: </w:t>
       </w:r>
       <w:r>
         <w:rPr>
@@ -3485,7 +3485,7 @@
           <w:szCs w:val="24"/>
           <w:rtl/>
         </w:rPr>
-        <w:t xml:space="preserve">סמאח: </w:t>
+        <w:t xml:space="preserve">סאמייה: </w:t>
       </w:r>
       <w:r>
         <w:rPr>
@@ -3539,7 +3539,7 @@
           <w:szCs w:val="24"/>
           <w:rtl/>
         </w:rPr>
-        <w:t xml:space="preserve">סמאח: </w:t>
+        <w:t xml:space="preserve">סאמייה: </w:t>
       </w:r>
       <w:r>
         <w:rPr>
@@ -3593,7 +3593,7 @@
           <w:szCs w:val="24"/>
           <w:rtl/>
         </w:rPr>
-        <w:t xml:space="preserve">סמאח: </w:t>
+        <w:t xml:space="preserve">סאמייה: </w:t>
       </w:r>
       <w:r>
         <w:rPr>
@@ -3647,7 +3647,7 @@
           <w:szCs w:val="24"/>
           <w:rtl/>
         </w:rPr>
-        <w:t xml:space="preserve">סמאח: </w:t>
+        <w:t xml:space="preserve">סאמייה: </w:t>
       </w:r>
       <w:r>
         <w:rPr>
@@ -3701,7 +3701,7 @@
           <w:szCs w:val="24"/>
           <w:rtl/>
         </w:rPr>
-        <w:t xml:space="preserve">סמאח: </w:t>
+        <w:t xml:space="preserve">סאמייה: </w:t>
       </w:r>
       <w:r>
         <w:rPr>
@@ -3755,7 +3755,7 @@
           <w:szCs w:val="24"/>
           <w:rtl/>
         </w:rPr>
-        <w:t xml:space="preserve">סמאח: </w:t>
+        <w:t xml:space="preserve">סאמייה: </w:t>
       </w:r>
       <w:r>
         <w:rPr>
@@ -3809,7 +3809,7 @@
           <w:szCs w:val="24"/>
           <w:rtl/>
         </w:rPr>
-        <w:t xml:space="preserve">סמאח: </w:t>
+        <w:t xml:space="preserve">סאמייה: </w:t>
       </w:r>
       <w:r>
         <w:rPr>
@@ -3890,7 +3890,7 @@
           <w:szCs w:val="24"/>
           <w:rtl/>
         </w:rPr>
-        <w:t xml:space="preserve">סמאח: </w:t>
+        <w:t xml:space="preserve">סאמייה: </w:t>
       </w:r>
       <w:r>
         <w:rPr>
@@ -3944,7 +3944,7 @@
           <w:szCs w:val="24"/>
           <w:rtl/>
         </w:rPr>
-        <w:t xml:space="preserve">סמאח: </w:t>
+        <w:t xml:space="preserve">סאמייה: </w:t>
       </w:r>
       <w:r>
         <w:rPr>
@@ -3998,7 +3998,7 @@
           <w:szCs w:val="24"/>
           <w:rtl/>
         </w:rPr>
-        <w:t xml:space="preserve">סמאח: </w:t>
+        <w:t xml:space="preserve">סאמייה: </w:t>
       </w:r>
       <w:r>
         <w:rPr>
@@ -4052,7 +4052,7 @@
           <w:szCs w:val="24"/>
           <w:rtl/>
         </w:rPr>
-        <w:t xml:space="preserve">סמאח: </w:t>
+        <w:t xml:space="preserve">סאמייה: </w:t>
       </w:r>
       <w:r>
         <w:rPr>
@@ -4106,7 +4106,7 @@
           <w:szCs w:val="24"/>
           <w:rtl/>
         </w:rPr>
-        <w:t xml:space="preserve">סמאח: </w:t>
+        <w:t xml:space="preserve">סאמייה: </w:t>
       </w:r>
       <w:r>
         <w:rPr>
@@ -4160,7 +4160,7 @@
           <w:szCs w:val="24"/>
           <w:rtl/>
         </w:rPr>
-        <w:t xml:space="preserve">סמאח: </w:t>
+        <w:t xml:space="preserve">סאמייה: </w:t>
       </w:r>
       <w:r>
         <w:rPr>
@@ -4214,7 +4214,7 @@
           <w:szCs w:val="24"/>
           <w:rtl/>
         </w:rPr>
-        <w:t xml:space="preserve">סמאח: </w:t>
+        <w:t xml:space="preserve">סאמייה: </w:t>
       </w:r>
       <w:r>
         <w:rPr>
@@ -4268,7 +4268,7 @@
           <w:szCs w:val="24"/>
           <w:rtl/>
         </w:rPr>
-        <w:t xml:space="preserve">סמאח: </w:t>
+        <w:t xml:space="preserve">סאמייה: </w:t>
       </w:r>
       <w:r>
         <w:rPr>
@@ -4322,7 +4322,7 @@
           <w:szCs w:val="24"/>
           <w:rtl/>
         </w:rPr>
-        <w:t xml:space="preserve">סמאח: </w:t>
+        <w:t xml:space="preserve">סאמייה: </w:t>
       </w:r>
       <w:r>
         <w:rPr>
@@ -4376,7 +4376,7 @@
           <w:szCs w:val="24"/>
           <w:rtl/>
         </w:rPr>
-        <w:t xml:space="preserve">סמאח: </w:t>
+        <w:t xml:space="preserve">סאמייה: </w:t>
       </w:r>
       <w:r>
         <w:rPr>
@@ -4430,7 +4430,7 @@
           <w:szCs w:val="24"/>
           <w:rtl/>
         </w:rPr>
-        <w:t xml:space="preserve">סמאח: </w:t>
+        <w:t xml:space="preserve">סאמייה: </w:t>
       </w:r>
       <w:r>
         <w:rPr>
@@ -4484,7 +4484,7 @@
           <w:szCs w:val="24"/>
           <w:rtl/>
         </w:rPr>
-        <w:t xml:space="preserve">סמאח: </w:t>
+        <w:t xml:space="preserve">סאמייה: </w:t>
       </w:r>
       <w:r>
         <w:rPr>
@@ -4538,7 +4538,7 @@
           <w:szCs w:val="24"/>
           <w:rtl/>
         </w:rPr>
-        <w:t xml:space="preserve">ראיון 2: ראניה, בת 24, שנה א' לחינוך. נערך בביתה, 24 במאי 2026, 88 דקות.</w:t>
+        <w:t xml:space="preserve">ראיון 2: עיינא, בת 24, שנה א' לחינוך. נערך בביתה, 24 במאי 2026, 88 דקות.</w:t>
       </w:r>
     </w:p>
     <w:p>
@@ -4583,16 +4583,16 @@
           <w:szCs w:val="24"/>
           <w:rtl/>
         </w:rPr>
-        <w:t xml:space="preserve">ראניה: </w:t>
-      </w:r>
-      <w:r>
-        <w:rPr>
-          <w:rFonts w:ascii="David" w:cs="David" w:eastAsia="David" w:hAnsi="David"/>
-          <w:sz w:val="24"/>
-          <w:szCs w:val="24"/>
-          <w:rtl/>
-        </w:rPr>
-        <w:t xml:space="preserve">ראניה. תקראי לי ראניה, זה שם של דודה שלי.</w:t>
+        <w:t xml:space="preserve">עיינא: </w:t>
+      </w:r>
+      <w:r>
+        <w:rPr>
+          <w:rFonts w:ascii="David" w:cs="David" w:eastAsia="David" w:hAnsi="David"/>
+          <w:sz w:val="24"/>
+          <w:szCs w:val="24"/>
+          <w:rtl/>
+        </w:rPr>
+        <w:t xml:space="preserve">עיינא. תקראי לי עיינא, זה שם של דודה שלי.</w:t>
       </w:r>
     </w:p>
     <w:p>
@@ -4619,25 +4619,25 @@
           <w:szCs w:val="24"/>
           <w:rtl/>
         </w:rPr>
-        <w:t xml:space="preserve">ראניה. אני עושה עבודה על נשים שהן אימהות, לומדות ועובדות במקביל, ומה שמעניין אותי זו החוויה עצמה. ספרי לי על יום רגיל שלך, מהקימה ועד השינה.</w:t>
-      </w:r>
-    </w:p>
-    <w:p>
-      <w:pPr>
-        <w:bidi/>
-        <w:spacing w:after="0" w:line="480" w:lineRule="auto"/>
-        <w:jc w:val="both"/>
-      </w:pPr>
-      <w:r>
-        <w:rPr>
-          <w:rFonts w:ascii="David" w:cs="David" w:eastAsia="David" w:hAnsi="David"/>
-          <w:b/>
-          <w:bCs/>
-          <w:sz w:val="24"/>
-          <w:szCs w:val="24"/>
-          <w:rtl/>
-        </w:rPr>
-        <w:t xml:space="preserve">ראניה: </w:t>
+        <w:t xml:space="preserve">עיינא. אני עושה עבודה על נשים שהן אימהות, לומדות ועובדות במקביל, ומה שמעניין אותי זו החוויה עצמה. ספרי לי על יום רגיל שלך, מהקימה ועד השינה.</w:t>
+      </w:r>
+    </w:p>
+    <w:p>
+      <w:pPr>
+        <w:bidi/>
+        <w:spacing w:after="0" w:line="480" w:lineRule="auto"/>
+        <w:jc w:val="both"/>
+      </w:pPr>
+      <w:r>
+        <w:rPr>
+          <w:rFonts w:ascii="David" w:cs="David" w:eastAsia="David" w:hAnsi="David"/>
+          <w:b/>
+          <w:bCs/>
+          <w:sz w:val="24"/>
+          <w:szCs w:val="24"/>
+          <w:rtl/>
+        </w:rPr>
+        <w:t xml:space="preserve">עיינא: </w:t>
       </w:r>
       <w:r>
         <w:rPr>
@@ -4691,7 +4691,7 @@
           <w:szCs w:val="24"/>
           <w:rtl/>
         </w:rPr>
-        <w:t xml:space="preserve">ראניה: </w:t>
+        <w:t xml:space="preserve">עיינא: </w:t>
       </w:r>
       <w:r>
         <w:rPr>
@@ -4745,7 +4745,7 @@
           <w:szCs w:val="24"/>
           <w:rtl/>
         </w:rPr>
-        <w:t xml:space="preserve">ראניה: </w:t>
+        <w:t xml:space="preserve">עיינא: </w:t>
       </w:r>
       <w:r>
         <w:rPr>
@@ -4799,7 +4799,7 @@
           <w:szCs w:val="24"/>
           <w:rtl/>
         </w:rPr>
-        <w:t xml:space="preserve">ראניה: </w:t>
+        <w:t xml:space="preserve">עיינא: </w:t>
       </w:r>
       <w:r>
         <w:rPr>
@@ -4853,7 +4853,7 @@
           <w:szCs w:val="24"/>
           <w:rtl/>
         </w:rPr>
-        <w:t xml:space="preserve">ראניה: </w:t>
+        <w:t xml:space="preserve">עיינא: </w:t>
       </w:r>
       <w:r>
         <w:rPr>
@@ -4907,7 +4907,7 @@
           <w:szCs w:val="24"/>
           <w:rtl/>
         </w:rPr>
-        <w:t xml:space="preserve">ראניה: </w:t>
+        <w:t xml:space="preserve">עיינא: </w:t>
       </w:r>
       <w:r>
         <w:rPr>
@@ -4961,7 +4961,7 @@
           <w:szCs w:val="24"/>
           <w:rtl/>
         </w:rPr>
-        <w:t xml:space="preserve">ראניה: </w:t>
+        <w:t xml:space="preserve">עיינא: </w:t>
       </w:r>
       <w:r>
         <w:rPr>
@@ -5015,7 +5015,7 @@
           <w:szCs w:val="24"/>
           <w:rtl/>
         </w:rPr>
-        <w:t xml:space="preserve">ראניה: </w:t>
+        <w:t xml:space="preserve">עיינא: </w:t>
       </w:r>
       <w:r>
         <w:rPr>
@@ -5069,7 +5069,7 @@
           <w:szCs w:val="24"/>
           <w:rtl/>
         </w:rPr>
-        <w:t xml:space="preserve">ראניה: </w:t>
+        <w:t xml:space="preserve">עיינא: </w:t>
       </w:r>
       <w:r>
         <w:rPr>
@@ -5123,7 +5123,7 @@
           <w:szCs w:val="24"/>
           <w:rtl/>
         </w:rPr>
-        <w:t xml:space="preserve">ראניה: </w:t>
+        <w:t xml:space="preserve">עיינא: </w:t>
       </w:r>
       <w:r>
         <w:rPr>
@@ -5177,7 +5177,7 @@
           <w:szCs w:val="24"/>
           <w:rtl/>
         </w:rPr>
-        <w:t xml:space="preserve">ראניה: </w:t>
+        <w:t xml:space="preserve">עיינא: </w:t>
       </w:r>
       <w:r>
         <w:rPr>
@@ -5231,7 +5231,7 @@
           <w:szCs w:val="24"/>
           <w:rtl/>
         </w:rPr>
-        <w:t xml:space="preserve">ראניה: </w:t>
+        <w:t xml:space="preserve">עיינא: </w:t>
       </w:r>
       <w:r>
         <w:rPr>
@@ -5285,7 +5285,7 @@
           <w:szCs w:val="24"/>
           <w:rtl/>
         </w:rPr>
-        <w:t xml:space="preserve">ראניה: </w:t>
+        <w:t xml:space="preserve">עיינא: </w:t>
       </w:r>
       <w:r>
         <w:rPr>
@@ -5339,7 +5339,7 @@
           <w:szCs w:val="24"/>
           <w:rtl/>
         </w:rPr>
-        <w:t xml:space="preserve">ראניה: </w:t>
+        <w:t xml:space="preserve">עיינא: </w:t>
       </w:r>
       <w:r>
         <w:rPr>
@@ -5393,7 +5393,7 @@
           <w:szCs w:val="24"/>
           <w:rtl/>
         </w:rPr>
-        <w:t xml:space="preserve">ראניה: </w:t>
+        <w:t xml:space="preserve">עיינא: </w:t>
       </w:r>
       <w:r>
         <w:rPr>
@@ -5447,7 +5447,7 @@
           <w:szCs w:val="24"/>
           <w:rtl/>
         </w:rPr>
-        <w:t xml:space="preserve">ראניה: </w:t>
+        <w:t xml:space="preserve">עיינא: </w:t>
       </w:r>
       <w:r>
         <w:rPr>
@@ -5501,7 +5501,7 @@
           <w:szCs w:val="24"/>
           <w:rtl/>
         </w:rPr>
-        <w:t xml:space="preserve">ראניה: </w:t>
+        <w:t xml:space="preserve">עיינא: </w:t>
       </w:r>
       <w:r>
         <w:rPr>
@@ -5555,7 +5555,7 @@
           <w:szCs w:val="24"/>
           <w:rtl/>
         </w:rPr>
-        <w:t xml:space="preserve">ראניה: </w:t>
+        <w:t xml:space="preserve">עיינא: </w:t>
       </w:r>
       <w:r>
         <w:rPr>
@@ -5609,7 +5609,7 @@
           <w:szCs w:val="24"/>
           <w:rtl/>
         </w:rPr>
-        <w:t xml:space="preserve">ראניה: </w:t>
+        <w:t xml:space="preserve">עיינא: </w:t>
       </w:r>
       <w:r>
         <w:rPr>
@@ -5663,7 +5663,7 @@
           <w:szCs w:val="24"/>
           <w:rtl/>
         </w:rPr>
-        <w:t xml:space="preserve">ראניה: </w:t>
+        <w:t xml:space="preserve">עיינא: </w:t>
       </w:r>
       <w:r>
         <w:rPr>
@@ -5717,7 +5717,7 @@
           <w:szCs w:val="24"/>
           <w:rtl/>
         </w:rPr>
-        <w:t xml:space="preserve">ראיון 3: הודא, בת 29, שנה ג' לסיעוד. נערך בשיחת וידאו, 31 במאי 2026, 64 דקות.</w:t>
+        <w:t xml:space="preserve">ראיון 3: רים, בת 29, שנה ג' לסיעוד. נערך בשיחת וידאו, 31 במאי 2026, 64 דקות.</w:t>
       </w:r>
     </w:p>
     <w:p>
@@ -5762,7 +5762,7 @@
           <w:szCs w:val="24"/>
           <w:rtl/>
         </w:rPr>
-        <w:t xml:space="preserve">הודא: </w:t>
+        <w:t xml:space="preserve">רים: </w:t>
       </w:r>
       <w:r>
         <w:rPr>
@@ -5816,7 +5816,7 @@
           <w:szCs w:val="24"/>
           <w:rtl/>
         </w:rPr>
-        <w:t xml:space="preserve">הודא: </w:t>
+        <w:t xml:space="preserve">רים: </w:t>
       </w:r>
       <w:r>
         <w:rPr>
@@ -5870,7 +5870,7 @@
           <w:szCs w:val="24"/>
           <w:rtl/>
         </w:rPr>
-        <w:t xml:space="preserve">הודא: </w:t>
+        <w:t xml:space="preserve">רים: </w:t>
       </w:r>
       <w:r>
         <w:rPr>
@@ -5924,7 +5924,7 @@
           <w:szCs w:val="24"/>
           <w:rtl/>
         </w:rPr>
-        <w:t xml:space="preserve">הודא: </w:t>
+        <w:t xml:space="preserve">רים: </w:t>
       </w:r>
       <w:r>
         <w:rPr>
@@ -5978,7 +5978,7 @@
           <w:szCs w:val="24"/>
           <w:rtl/>
         </w:rPr>
-        <w:t xml:space="preserve">הודא: </w:t>
+        <w:t xml:space="preserve">רים: </w:t>
       </w:r>
       <w:r>
         <w:rPr>
@@ -6032,7 +6032,7 @@
           <w:szCs w:val="24"/>
           <w:rtl/>
         </w:rPr>
-        <w:t xml:space="preserve">הודא: </w:t>
+        <w:t xml:space="preserve">רים: </w:t>
       </w:r>
       <w:r>
         <w:rPr>
@@ -6086,7 +6086,7 @@
           <w:szCs w:val="24"/>
           <w:rtl/>
         </w:rPr>
-        <w:t xml:space="preserve">הודא: </w:t>
+        <w:t xml:space="preserve">רים: </w:t>
       </w:r>
       <w:r>
         <w:rPr>
@@ -6140,7 +6140,7 @@
           <w:szCs w:val="24"/>
           <w:rtl/>
         </w:rPr>
-        <w:t xml:space="preserve">הודא: </w:t>
+        <w:t xml:space="preserve">רים: </w:t>
       </w:r>
       <w:r>
         <w:rPr>
@@ -6194,7 +6194,7 @@
           <w:szCs w:val="24"/>
           <w:rtl/>
         </w:rPr>
-        <w:t xml:space="preserve">הודא: </w:t>
+        <w:t xml:space="preserve">רים: </w:t>
       </w:r>
       <w:r>
         <w:rPr>
@@ -6248,7 +6248,7 @@
           <w:szCs w:val="24"/>
           <w:rtl/>
         </w:rPr>
-        <w:t xml:space="preserve">הודא: </w:t>
+        <w:t xml:space="preserve">רים: </w:t>
       </w:r>
       <w:r>
         <w:rPr>
@@ -6302,7 +6302,7 @@
           <w:szCs w:val="24"/>
           <w:rtl/>
         </w:rPr>
-        <w:t xml:space="preserve">הודא: </w:t>
+        <w:t xml:space="preserve">רים: </w:t>
       </w:r>
       <w:r>
         <w:rPr>
@@ -6356,7 +6356,7 @@
           <w:szCs w:val="24"/>
           <w:rtl/>
         </w:rPr>
-        <w:t xml:space="preserve">הודא: </w:t>
+        <w:t xml:space="preserve">רים: </w:t>
       </w:r>
       <w:r>
         <w:rPr>
@@ -6410,7 +6410,7 @@
           <w:szCs w:val="24"/>
           <w:rtl/>
         </w:rPr>
-        <w:t xml:space="preserve">הודא: </w:t>
+        <w:t xml:space="preserve">רים: </w:t>
       </w:r>
       <w:r>
         <w:rPr>
@@ -6464,7 +6464,7 @@
           <w:szCs w:val="24"/>
           <w:rtl/>
         </w:rPr>
-        <w:t xml:space="preserve">הודא: </w:t>
+        <w:t xml:space="preserve">רים: </w:t>
       </w:r>
       <w:r>
         <w:rPr>
@@ -6518,7 +6518,7 @@
           <w:szCs w:val="24"/>
           <w:rtl/>
         </w:rPr>
-        <w:t xml:space="preserve">הודא: </w:t>
+        <w:t xml:space="preserve">רים: </w:t>
       </w:r>
       <w:r>
         <w:rPr>
@@ -6572,7 +6572,7 @@
           <w:szCs w:val="24"/>
           <w:rtl/>
         </w:rPr>
-        <w:t xml:space="preserve">הודא: </w:t>
+        <w:t xml:space="preserve">רים: </w:t>
       </w:r>
       <w:r>
         <w:rPr>
@@ -6626,7 +6626,7 @@
           <w:szCs w:val="24"/>
           <w:rtl/>
         </w:rPr>
-        <w:t xml:space="preserve">הודא: </w:t>
+        <w:t xml:space="preserve">רים: </w:t>
       </w:r>
       <w:r>
         <w:rPr>
@@ -7575,7 +7575,7 @@
           <w:szCs w:val="24"/>
           <w:rtl/>
         </w:rPr>
-        <w:t xml:space="preserve">שם המרואיינת (שם בדוי לצורך העבודה): סמאח</w:t>
+        <w:t xml:space="preserve">שם המרואיינת (שם בדוי לצורך העבודה): סאמייה</w:t>
       </w:r>
     </w:p>
     <w:p>
@@ -7807,7 +7807,7 @@
           <w:szCs w:val="24"/>
           <w:rtl/>
         </w:rPr>
-        <w:t xml:space="preserve">שם המרואיינת (שם בדוי לצורך העבודה): ראניה</w:t>
+        <w:t xml:space="preserve">שם המרואיינת (שם בדוי לצורך העבודה): עיינא</w:t>
       </w:r>
     </w:p>
     <w:p>
@@ -8039,7 +8039,7 @@
           <w:szCs w:val="24"/>
           <w:rtl/>
         </w:rPr>
-        <w:t xml:space="preserve">שם המרואיינת (שם בדוי לצורך העבודה): הודא</w:t>
+        <w:t xml:space="preserve">שם המרואיינת (שם בדוי לצורך העבודה): רים</w:t>
       </w:r>
     </w:p>
     <w:p>

</xml_diff>

<commit_message>
Add per-interviewee selection rationale and anticipated access difficulties
The course guidelines ask the methodology chapter to state why each
interviewee was chosen and what difficulties in reaching them were
expected. Section 2.2 now covers both.

Co-Authored-By: Claude Opus 5 <noreply@anthropic.com>
Claude-Session: https://claude.ai/code/session_01EG6i6REnRBMzUsj4m2kHAL
</commit_message>
<xml_diff>
--- a/docs/עבודה מסכמת - חווייתן של אימהות ערביות צעירות.docx
+++ b/docs/עבודה מסכמת - חווייתן של אימהות ערביות צעירות.docx
@@ -498,7 +498,7 @@
           <w:szCs w:val="24"/>
           <w:rtl/>
         </w:rPr>
-        <w:t xml:space="preserve">הגיוס נעשה בפנייה אישית לסטודנטית מוכרת מן המכללה, וממנה בשיטת כדור השלג לשתי נשים נוספות. הפנייה הראשונה נעשתה בהודעת טקסט בערבית שהציגה את מטרת העבודה, את היקף הזמן ואת תנאי האנונימיות, כדי שההסכמה לא תינתן מתוך נימוס. שלוש המרואיינות נשואות ומתגוררות ביישובים ערביים בצפון ובמשולש. אין בהן ייצוג לנשים בדוויות, דרוזיות או נוצריות, שתנאי חייהן שונים, ולא לנשים חד הוריות. זו מגבלה מובנית של העבודה ולא רק של גודל המדגם.</w:t>
+        <w:t xml:space="preserve">הגיוס נעשה בפנייה אישית לסטודנטית מוכרת מן המכללה, וממנה בשיטת כדור השלג לשתי נשים נוספות. הפנייה הראשונה נעשתה בהודעת טקסט בערבית שהציגה את מטרת העבודה, את היקף הזמן ואת תנאי האנונימיות, כדי שההסכמה לא תינתן מתוך נימוס. מעבר לקריטריונים נבחרו השלוש גם מתוך שאיפה לגיוון: אחת מכפר קטן ואחת מעיר מעורבת, אחת בתחילת התואר ואחת בסופו, אחת בעלת סידור טיפול קבוע ואחת שנוסעת שעה וחצי לכל כיוון. הקושי שנצפה מראש בגישה אליהן לא היה הסכמה עקרונית אלא זמן, ולכן נקבע שהראיון ייערך בבית ובשעה שתבחר המרואיינת, וכי ניתן יהיה לפצל אותו לשני מפגשים. שלושתן נשואות ומתגוררות ביישובים ערביים בצפון ובמשולש. אין בהן ייצוג לנשים בדוויות, דרוזיות או נוצריות, שתנאי חייהן שונים, ולא לנשים חד הוריות. זו מגבלה מובנית של העבודה ולא רק של גודל המדגם.</w:t>
       </w:r>
     </w:p>
     <w:p>
@@ -1488,7 +1488,7 @@
           <w:szCs w:val="24"/>
           <w:rtl/>
         </w:rPr>
-        <w:t xml:space="preserve">שמירת האנונימיות מציבה כאן קושי מיוחד. ביישוב שבו כל אחד מכיר את כולם, צירוף של תחום לימודים, מספר ילדים ומקום עבודה עלול לזהות אישה גם בלי שמה. לכן הוחלפו השמות בשמות בדויים, שמות היישובים הוחלפו בתיאור כללי, שמות המעסיקים הושמטו וגילי הילדים עוגלו. פרט מזהה נוסף, מקצועו של אחד מבני הזוג, הוסר לחלוטין.</w:t>
+        <w:t xml:space="preserve">שמירת האנונימיות מציבה כאן קושי מיוחד: ביישוב שבו כולם מכירים זה את זה, צירוף של תחום לימודים, מספר ילדים ומקום עבודה עלול לזהות אישה גם בלי שמה. לכן הוחלפו השמות בשמות בדויים, שמות היישובים בתיאור כללי, שמות המעסיקים הושמטו וגילי הילדים עוגלו. פרט מזהה נוסף, מקצועו של אחד מבני הזוג, הוסר לחלוטין.</w:t>
       </w:r>
     </w:p>
     <w:p>

</xml_diff>